<commit_message>
Tzaeschke KDTree added. Insert and find tests
</commit_message>
<xml_diff>
--- a/doc/S1_Zadanie2_Niznansky.docx
+++ b/doc/S1_Zadanie2_Niznansky.docx
@@ -882,14 +882,9 @@
         <w:pStyle w:val="AIKapitola"/>
       </w:pPr>
       <w:bookmarkStart w:id="0" w:name="_Toc243767150"/>
-      <w:proofErr w:type="spellStart"/>
       <w:r>
         <w:lastRenderedPageBreak/>
-        <w:t>Quad</w:t>
-      </w:r>
-      <w:proofErr w:type="spellEnd"/>
-      <w:r>
-        <w:t xml:space="preserve"> Strom implementovaný v semestrálnej práci</w:t>
+        <w:t>Quad Strom implementovaný v semestrálnej práci</w:t>
       </w:r>
       <w:bookmarkEnd w:id="0"/>
     </w:p>
@@ -898,15 +893,7 @@
         <w:pStyle w:val="SPtext"/>
       </w:pPr>
       <w:r>
-        <w:t xml:space="preserve">Pri testovaní </w:t>
-      </w:r>
-      <w:proofErr w:type="spellStart"/>
-      <w:r>
-        <w:t>Quad</w:t>
-      </w:r>
-      <w:proofErr w:type="spellEnd"/>
-      <w:r>
-        <w:t xml:space="preserve"> stromu boli využité celkovo 4 testy:</w:t>
+        <w:t>Pri testovaní Quad stromu boli využité celkovo 4 testy:</w:t>
       </w:r>
     </w:p>
     <w:p>
@@ -935,30 +922,8 @@
         <w:rPr>
           <w:u w:val="single"/>
         </w:rPr>
-        <w:t xml:space="preserve">Apache </w:t>
-      </w:r>
-      <w:proofErr w:type="spellStart"/>
-      <w:r>
-        <w:rPr>
-          <w:u w:val="single"/>
-        </w:rPr>
-        <w:t>NetBeans</w:t>
-      </w:r>
-      <w:proofErr w:type="spellEnd"/>
-      <w:r>
-        <w:rPr>
-          <w:u w:val="single"/>
-        </w:rPr>
-        <w:t xml:space="preserve"> </w:t>
-      </w:r>
-      <w:proofErr w:type="spellStart"/>
-      <w:r>
-        <w:rPr>
-          <w:u w:val="single"/>
-        </w:rPr>
-        <w:t>profilera</w:t>
-      </w:r>
-      <w:proofErr w:type="spellEnd"/>
+        <w:t>Apache NetBeans profilera</w:t>
+      </w:r>
     </w:p>
     <w:p>
       <w:pPr>
@@ -986,30 +951,8 @@
         <w:rPr>
           <w:u w:val="single"/>
         </w:rPr>
-        <w:t xml:space="preserve">Apache </w:t>
-      </w:r>
-      <w:proofErr w:type="spellStart"/>
-      <w:r>
-        <w:rPr>
-          <w:u w:val="single"/>
-        </w:rPr>
-        <w:t>NetBeans</w:t>
-      </w:r>
-      <w:proofErr w:type="spellEnd"/>
-      <w:r>
-        <w:rPr>
-          <w:u w:val="single"/>
-        </w:rPr>
-        <w:t xml:space="preserve"> </w:t>
-      </w:r>
-      <w:proofErr w:type="spellStart"/>
-      <w:r>
-        <w:rPr>
-          <w:u w:val="single"/>
-        </w:rPr>
-        <w:t>profilera</w:t>
-      </w:r>
-      <w:proofErr w:type="spellEnd"/>
+        <w:t>Apache NetBeans profilera</w:t>
+      </w:r>
     </w:p>
     <w:p>
       <w:pPr>
@@ -1121,6 +1064,7 @@
         <w:rPr>
           <w:b/>
           <w:bCs/>
+          <w:noProof/>
         </w:rPr>
         <w:drawing>
           <wp:anchor distT="0" distB="0" distL="114300" distR="114300" simplePos="0" relativeHeight="251661312" behindDoc="0" locked="0" layoutInCell="1" allowOverlap="1" wp14:anchorId="4463E671" wp14:editId="71025A15">
@@ -1276,15 +1220,7 @@
         <w:pStyle w:val="SPtext"/>
       </w:pPr>
       <w:r>
-        <w:t xml:space="preserve">Pri testovaní </w:t>
-      </w:r>
-      <w:proofErr w:type="spellStart"/>
-      <w:r>
-        <w:t>Quad</w:t>
-      </w:r>
-      <w:proofErr w:type="spellEnd"/>
-      <w:r>
-        <w:t xml:space="preserve"> stromu boli využité celkovo 4 testy:</w:t>
+        <w:t>Pri testovaní Quad stromu boli využité celkovo 4 testy:</w:t>
       </w:r>
     </w:p>
     <w:p>
@@ -1301,14 +1237,7 @@
           <w:b/>
           <w:bCs/>
         </w:rPr>
-        <w:t xml:space="preserve">1. </w:t>
-      </w:r>
-      <w:r>
-        <w:rPr>
-          <w:b/>
-          <w:bCs/>
-        </w:rPr>
-        <w:t>Rýchlostný test operácie vloženia:</w:t>
+        <w:t>1. Rýchlostný test operácie vloženia:</w:t>
       </w:r>
       <w:r>
         <w:t xml:space="preserve"> meranie času, za ktorý sa dáta zo zadaného súboru ‚slovakia_nodes.csv‘ vložili do štruktúry pomocou </w:t>
@@ -1317,30 +1246,8 @@
         <w:rPr>
           <w:u w:val="single"/>
         </w:rPr>
-        <w:t xml:space="preserve">Apache </w:t>
-      </w:r>
-      <w:proofErr w:type="spellStart"/>
-      <w:r>
-        <w:rPr>
-          <w:u w:val="single"/>
-        </w:rPr>
-        <w:t>NetBeans</w:t>
-      </w:r>
-      <w:proofErr w:type="spellEnd"/>
-      <w:r>
-        <w:rPr>
-          <w:u w:val="single"/>
-        </w:rPr>
-        <w:t xml:space="preserve"> </w:t>
-      </w:r>
-      <w:proofErr w:type="spellStart"/>
-      <w:r>
-        <w:rPr>
-          <w:u w:val="single"/>
-        </w:rPr>
-        <w:t>profilera</w:t>
-      </w:r>
-      <w:proofErr w:type="spellEnd"/>
+        <w:t>Apache NetBeans profilera</w:t>
+      </w:r>
     </w:p>
     <w:p>
       <w:pPr>
@@ -1356,14 +1263,7 @@
           <w:b/>
           <w:bCs/>
         </w:rPr>
-        <w:t xml:space="preserve">2. </w:t>
-      </w:r>
-      <w:r>
-        <w:rPr>
-          <w:b/>
-          <w:bCs/>
-        </w:rPr>
-        <w:t>Rýchlostný test hľadania:</w:t>
+        <w:t>2. Rýchlostný test hľadania:</w:t>
       </w:r>
       <w:r>
         <w:t xml:space="preserve"> meranie času, za ktorý sa vyhľadali všetky zadané oblasti zo zadaného súboru ‚testovacie_oblasti.csv‘ pomocou </w:t>
@@ -1372,30 +1272,8 @@
         <w:rPr>
           <w:u w:val="single"/>
         </w:rPr>
-        <w:t xml:space="preserve">Apache </w:t>
-      </w:r>
-      <w:proofErr w:type="spellStart"/>
-      <w:r>
-        <w:rPr>
-          <w:u w:val="single"/>
-        </w:rPr>
-        <w:t>NetBeans</w:t>
-      </w:r>
-      <w:proofErr w:type="spellEnd"/>
-      <w:r>
-        <w:rPr>
-          <w:u w:val="single"/>
-        </w:rPr>
-        <w:t xml:space="preserve"> </w:t>
-      </w:r>
-      <w:proofErr w:type="spellStart"/>
-      <w:r>
-        <w:rPr>
-          <w:u w:val="single"/>
-        </w:rPr>
-        <w:t>profilera</w:t>
-      </w:r>
-      <w:proofErr w:type="spellEnd"/>
+        <w:t>Apache NetBeans profilera</w:t>
+      </w:r>
     </w:p>
     <w:p>
       <w:pPr>
@@ -1411,14 +1289,7 @@
           <w:b/>
           <w:bCs/>
         </w:rPr>
-        <w:t xml:space="preserve">3. </w:t>
-      </w:r>
-      <w:r>
-        <w:rPr>
-          <w:b/>
-          <w:bCs/>
-        </w:rPr>
-        <w:t xml:space="preserve">Test správnosti operácie vloženia: </w:t>
+        <w:t xml:space="preserve">3. Test správnosti operácie vloženia: </w:t>
       </w:r>
       <w:r>
         <w:t>do stromu bolo vložených 100000 náhodných hodnôt (x, y, dáta). Kontrola, či sa všetky vložené hodnoty v strome  nachádzali.</w:t>
@@ -1438,14 +1309,7 @@
           <w:b/>
           <w:bCs/>
         </w:rPr>
-        <w:t xml:space="preserve">4. </w:t>
-      </w:r>
-      <w:r>
-        <w:rPr>
-          <w:b/>
-          <w:bCs/>
-        </w:rPr>
-        <w:t>Test správnosti operácie hľadania:</w:t>
+        <w:t>4. Test správnosti operácie hľadania:</w:t>
       </w:r>
       <w:r>
         <w:t xml:space="preserve"> nad stromom boli s pravdepodobnosťou 50% robené operácie vloženia a hľadania 100000-krát (t.j. približne 50000 operácií vloženia a 50000 operácií hľadania). Kontrola, či sa pri hľadaní náhodných oblastí našli všetky požadované hodnoty.</w:t>
@@ -1480,14 +1344,7 @@
           <w:b/>
           <w:bCs/>
         </w:rPr>
-        <w:t xml:space="preserve">1. </w:t>
-      </w:r>
-      <w:r>
-        <w:rPr>
-          <w:b/>
-          <w:bCs/>
-        </w:rPr>
-        <w:t xml:space="preserve">Test: </w:t>
+        <w:t xml:space="preserve">1. Test: </w:t>
       </w:r>
       <w:r>
         <w:t xml:space="preserve">rýchlosť operácie vloženia bola približne </w:t>
@@ -1510,6 +1367,7 @@
         <w:rPr>
           <w:b/>
           <w:bCs/>
+          <w:noProof/>
         </w:rPr>
         <w:drawing>
           <wp:anchor distT="0" distB="0" distL="114300" distR="114300" simplePos="0" relativeHeight="251662336" behindDoc="0" locked="0" layoutInCell="1" allowOverlap="1" wp14:anchorId="316D33C2" wp14:editId="1D51FAAA">
@@ -1572,14 +1430,7 @@
           <w:b/>
           <w:bCs/>
         </w:rPr>
-        <w:t xml:space="preserve">2. </w:t>
-      </w:r>
-      <w:r>
-        <w:rPr>
-          <w:b/>
-          <w:bCs/>
-        </w:rPr>
-        <w:t>Test:</w:t>
+        <w:t>2. Test:</w:t>
       </w:r>
       <w:r>
         <w:t xml:space="preserve"> rýchlosť operácií hľadania bola približne </w:t>
@@ -1653,14 +1504,9 @@
         <w:pStyle w:val="AIKapitola"/>
       </w:pPr>
       <w:bookmarkStart w:id="2" w:name="_Toc243767152"/>
-      <w:proofErr w:type="spellStart"/>
       <w:r>
         <w:lastRenderedPageBreak/>
-        <w:t>Quad</w:t>
-      </w:r>
-      <w:proofErr w:type="spellEnd"/>
-      <w:r>
-        <w:t xml:space="preserve"> Strom spojený s KD Stromom implementovaný v semestrálnej práci</w:t>
+        <w:t>Quad Strom spojený s KD Stromom implementovaný v semestrálnej práci</w:t>
       </w:r>
       <w:bookmarkEnd w:id="2"/>
     </w:p>
@@ -1669,15 +1515,7 @@
         <w:pStyle w:val="SPtext"/>
       </w:pPr>
       <w:r>
-        <w:t xml:space="preserve">Pri testovaní </w:t>
-      </w:r>
-      <w:proofErr w:type="spellStart"/>
-      <w:r>
-        <w:t>Quad</w:t>
-      </w:r>
-      <w:proofErr w:type="spellEnd"/>
-      <w:r>
-        <w:t xml:space="preserve"> stromu boli využité celkovo 4 testy:</w:t>
+        <w:t>Pri testovaní Quad stromu boli využité celkovo 4 testy:</w:t>
       </w:r>
     </w:p>
     <w:p>
@@ -1702,157 +1540,116 @@
         <w:rPr>
           <w:u w:val="single"/>
         </w:rPr>
-        <w:t xml:space="preserve">Apache </w:t>
-      </w:r>
-      <w:proofErr w:type="spellStart"/>
+        <w:t>Apache NetBeans profilera</w:t>
+      </w:r>
+    </w:p>
+    <w:p>
+      <w:pPr>
+        <w:pStyle w:val="SPtext"/>
+        <w:rPr>
+          <w:b/>
+          <w:bCs/>
+        </w:rPr>
+      </w:pPr>
+      <w:r>
+        <w:rPr>
+          <w:b/>
+          <w:bCs/>
+        </w:rPr>
+        <w:t>2. Rýchlostný test hľadania:</w:t>
+      </w:r>
+      <w:r>
+        <w:t xml:space="preserve"> meranie času, za ktorý sa vyhľadali všetky zadané oblasti zo zadaného súboru ‚testovacie_oblasti.csv‘ pomocou </w:t>
+      </w:r>
       <w:r>
         <w:rPr>
           <w:u w:val="single"/>
         </w:rPr>
-        <w:t>NetBeans</w:t>
-      </w:r>
-      <w:proofErr w:type="spellEnd"/>
+        <w:t>Apache NetBeans profilera</w:t>
+      </w:r>
+    </w:p>
+    <w:p>
+      <w:pPr>
+        <w:pStyle w:val="SPtext"/>
+        <w:rPr>
+          <w:b/>
+          <w:bCs/>
+        </w:rPr>
+      </w:pPr>
+      <w:r>
+        <w:rPr>
+          <w:b/>
+          <w:bCs/>
+        </w:rPr>
+        <w:t xml:space="preserve">3. Test správnosti operácie vloženia: </w:t>
+      </w:r>
+      <w:r>
+        <w:t>do stromu bolo vložených 100000 náhodných hodnôt (x, y, dáta). Kontrola, či sa všetky vložené hodnoty v strome  nachádzali.</w:t>
+      </w:r>
+    </w:p>
+    <w:p>
+      <w:pPr>
+        <w:pStyle w:val="SPtext"/>
+        <w:rPr>
+          <w:b/>
+          <w:bCs/>
+        </w:rPr>
+      </w:pPr>
+      <w:r>
+        <w:rPr>
+          <w:b/>
+          <w:bCs/>
+        </w:rPr>
+        <w:t>4. Test správnosti operácie hľadania:</w:t>
+      </w:r>
+      <w:r>
+        <w:t xml:space="preserve"> nad stromom boli s pravdepodobnosťou 50% robené operácie vloženia a hľadania 100000-krát (t.j. približne 50000 operácií vloženia a 50000 operácií hľadania). Kontrola, či sa pri hľadaní náhodných oblastí našli všetky požadované hodnoty.</w:t>
+      </w:r>
+    </w:p>
+    <w:p>
+      <w:pPr>
+        <w:pStyle w:val="SPtext"/>
+      </w:pPr>
+      <w:r>
+        <w:t>Výsledky testovania:</w:t>
+      </w:r>
+    </w:p>
+    <w:p>
+      <w:pPr>
+        <w:pStyle w:val="SPtext"/>
+        <w:rPr>
+          <w:b/>
+          <w:bCs/>
+        </w:rPr>
+      </w:pPr>
+      <w:r>
+        <w:rPr>
+          <w:b/>
+          <w:bCs/>
+        </w:rPr>
+        <w:t xml:space="preserve">1. Test: </w:t>
+      </w:r>
+      <w:r>
+        <w:t xml:space="preserve">rýchlosť operácie vloženia bola približne </w:t>
+      </w:r>
       <w:r>
         <w:rPr>
           <w:u w:val="single"/>
         </w:rPr>
-        <w:t xml:space="preserve"> </w:t>
-      </w:r>
-      <w:proofErr w:type="spellStart"/>
-      <w:r>
-        <w:rPr>
-          <w:u w:val="single"/>
-        </w:rPr>
-        <w:t>profilera</w:t>
-      </w:r>
-      <w:proofErr w:type="spellEnd"/>
+        <w:t>5000</w:t>
+      </w:r>
+      <w:r>
+        <w:t xml:space="preserve"> ms</w:t>
+      </w:r>
     </w:p>
     <w:p>
       <w:pPr>
         <w:pStyle w:val="SPtext"/>
-        <w:rPr>
-          <w:b/>
-          <w:bCs/>
-        </w:rPr>
-      </w:pPr>
-      <w:r>
-        <w:rPr>
-          <w:b/>
-          <w:bCs/>
-        </w:rPr>
-        <w:t>2. Rýchlostný test hľadania:</w:t>
-      </w:r>
-      <w:r>
-        <w:t xml:space="preserve"> meranie času, za ktorý sa vyhľadali všetky zadané oblasti zo zadaného súboru ‚testovacie_oblasti.csv‘ pomocou </w:t>
-      </w:r>
-      <w:r>
-        <w:rPr>
-          <w:u w:val="single"/>
-        </w:rPr>
-        <w:t xml:space="preserve">Apache </w:t>
-      </w:r>
-      <w:proofErr w:type="spellStart"/>
-      <w:r>
-        <w:rPr>
-          <w:u w:val="single"/>
-        </w:rPr>
-        <w:t>NetBeans</w:t>
-      </w:r>
-      <w:proofErr w:type="spellEnd"/>
-      <w:r>
-        <w:rPr>
-          <w:u w:val="single"/>
-        </w:rPr>
-        <w:t xml:space="preserve"> </w:t>
-      </w:r>
-      <w:proofErr w:type="spellStart"/>
-      <w:r>
-        <w:rPr>
-          <w:u w:val="single"/>
-        </w:rPr>
-        <w:t>profilera</w:t>
-      </w:r>
-      <w:proofErr w:type="spellEnd"/>
-    </w:p>
-    <w:p>
-      <w:pPr>
-        <w:pStyle w:val="SPtext"/>
-        <w:rPr>
-          <w:b/>
-          <w:bCs/>
-        </w:rPr>
-      </w:pPr>
-      <w:r>
-        <w:rPr>
-          <w:b/>
-          <w:bCs/>
-        </w:rPr>
-        <w:t xml:space="preserve">3. Test správnosti operácie vloženia: </w:t>
-      </w:r>
-      <w:r>
-        <w:t>do stromu bolo vložených 100000 náhodných hodnôt (x, y, dáta). Kontrola, či sa všetky vložené hodnoty v strome  nachádzali.</w:t>
-      </w:r>
-    </w:p>
-    <w:p>
-      <w:pPr>
-        <w:pStyle w:val="SPtext"/>
-        <w:rPr>
-          <w:b/>
-          <w:bCs/>
-        </w:rPr>
-      </w:pPr>
-      <w:r>
-        <w:rPr>
-          <w:b/>
-          <w:bCs/>
-        </w:rPr>
-        <w:t>4. Test správnosti operácie hľadania:</w:t>
-      </w:r>
-      <w:r>
-        <w:t xml:space="preserve"> nad stromom boli s pravdepodobnosťou 50% robené operácie vloženia a hľadania 100000-krát (t.j. približne 50000 operácií vloženia a 50000 operácií hľadania). Kontrola, či sa pri hľadaní náhodných oblastí našli všetky požadované hodnoty.</w:t>
-      </w:r>
-    </w:p>
-    <w:p>
-      <w:pPr>
-        <w:pStyle w:val="SPtext"/>
-      </w:pPr>
-      <w:r>
-        <w:t>Výsledky testovania:</w:t>
-      </w:r>
-    </w:p>
-    <w:p>
-      <w:pPr>
-        <w:pStyle w:val="SPtext"/>
-        <w:rPr>
-          <w:b/>
-          <w:bCs/>
-        </w:rPr>
-      </w:pPr>
-      <w:r>
-        <w:rPr>
-          <w:b/>
-          <w:bCs/>
-        </w:rPr>
-        <w:t xml:space="preserve">1. Test: </w:t>
-      </w:r>
-      <w:r>
-        <w:t xml:space="preserve">rýchlosť operácie vloženia bola približne </w:t>
-      </w:r>
-      <w:r>
-        <w:rPr>
-          <w:u w:val="single"/>
-        </w:rPr>
-        <w:t>5000</w:t>
-      </w:r>
-      <w:r>
-        <w:t xml:space="preserve"> ms</w:t>
-      </w:r>
-    </w:p>
-    <w:p>
-      <w:pPr>
-        <w:pStyle w:val="SPtext"/>
-      </w:pPr>
-      <w:r>
+      </w:pPr>
+      <w:r>
+        <w:rPr>
+          <w:noProof/>
+        </w:rPr>
         <w:drawing>
           <wp:anchor distT="0" distB="0" distL="114300" distR="114300" simplePos="0" relativeHeight="251663360" behindDoc="0" locked="0" layoutInCell="1" allowOverlap="1" wp14:anchorId="06D6FC99" wp14:editId="2E0A5ABD">
             <wp:simplePos x="0" y="0"/>
@@ -1974,36 +1771,18 @@
         <w:pStyle w:val="AIKapitola"/>
       </w:pPr>
       <w:bookmarkStart w:id="3" w:name="_Toc243767153"/>
-      <w:proofErr w:type="spellStart"/>
       <w:r>
         <w:lastRenderedPageBreak/>
-        <w:t>Quad</w:t>
-      </w:r>
-      <w:proofErr w:type="spellEnd"/>
-      <w:r>
-        <w:t xml:space="preserve"> Strom z GitHub repozitára používateľa </w:t>
-      </w:r>
-      <w:proofErr w:type="spellStart"/>
-      <w:r>
-        <w:t>Varunpant</w:t>
+        <w:t>Quad Strom z GitHub repozitára používateľa Varunpant</w:t>
       </w:r>
       <w:bookmarkEnd w:id="3"/>
-      <w:proofErr w:type="spellEnd"/>
     </w:p>
     <w:p>
       <w:pPr>
         <w:pStyle w:val="SPtext"/>
       </w:pPr>
       <w:r>
-        <w:t xml:space="preserve">Pri testovaní </w:t>
-      </w:r>
-      <w:proofErr w:type="spellStart"/>
-      <w:r>
-        <w:t>Quad</w:t>
-      </w:r>
-      <w:proofErr w:type="spellEnd"/>
-      <w:r>
-        <w:t xml:space="preserve"> stromu boli využité celkovo 4 testy:</w:t>
+        <w:t>Pri testovaní Quad stromu boli využité celkovo 4 testy:</w:t>
       </w:r>
     </w:p>
     <w:p>
@@ -2045,30 +1824,8 @@
         <w:rPr>
           <w:u w:val="single"/>
         </w:rPr>
-        <w:t xml:space="preserve"> </w:t>
-      </w:r>
-      <w:proofErr w:type="spellStart"/>
-      <w:r>
-        <w:rPr>
-          <w:u w:val="single"/>
-        </w:rPr>
-        <w:t>NetBeans</w:t>
-      </w:r>
-      <w:proofErr w:type="spellEnd"/>
-      <w:r>
-        <w:rPr>
-          <w:u w:val="single"/>
-        </w:rPr>
-        <w:t xml:space="preserve"> </w:t>
-      </w:r>
-      <w:proofErr w:type="spellStart"/>
-      <w:r>
-        <w:rPr>
-          <w:u w:val="single"/>
-        </w:rPr>
-        <w:t>profilera</w:t>
-      </w:r>
-      <w:proofErr w:type="spellEnd"/>
+        <w:t xml:space="preserve"> NetBeans profilera</w:t>
+      </w:r>
     </w:p>
     <w:p>
       <w:pPr>
@@ -2102,28 +1859,12 @@
         </w:rPr>
         <w:t xml:space="preserve">Apache </w:t>
       </w:r>
-      <w:proofErr w:type="spellStart"/>
       <w:r>
         <w:rPr>
           <w:u w:val="single"/>
         </w:rPr>
-        <w:t>NetBeans</w:t>
-      </w:r>
-      <w:proofErr w:type="spellEnd"/>
-      <w:r>
-        <w:rPr>
-          <w:u w:val="single"/>
-        </w:rPr>
-        <w:t xml:space="preserve"> </w:t>
-      </w:r>
-      <w:proofErr w:type="spellStart"/>
-      <w:r>
-        <w:rPr>
-          <w:u w:val="single"/>
-        </w:rPr>
-        <w:t>profilera</w:t>
-      </w:r>
-      <w:proofErr w:type="spellEnd"/>
+        <w:t>NetBeans profilera</w:t>
+      </w:r>
     </w:p>
     <w:p>
       <w:pPr>
@@ -2295,6 +2036,7 @@
         <w:rPr>
           <w:b/>
           <w:bCs/>
+          <w:noProof/>
         </w:rPr>
         <w:drawing>
           <wp:anchor distT="0" distB="0" distL="114300" distR="114300" simplePos="0" relativeHeight="251659264" behindDoc="0" locked="0" layoutInCell="1" allowOverlap="1" wp14:anchorId="60A327AE" wp14:editId="7CD91559">
@@ -2385,7 +2127,7 @@
         <w:t xml:space="preserve"> </w:t>
       </w:r>
       <w:r>
-        <w:t>všetky vložené hodnoty sa v strome nachádzali</w:t>
+        <w:t>stom nepovoľuje pridávanie duplicitných kľúčov. Pri pridávaní duplicitných kľúčov sa pôvodná hodnota prepíše novou.</w:t>
       </w:r>
     </w:p>
     <w:p>
@@ -2408,7 +2150,10 @@
         <w:t>Test:</w:t>
       </w:r>
       <w:r>
-        <w:t xml:space="preserve"> všetky operácie hľadania našli správne hodnoty</w:t>
+        <w:t xml:space="preserve"> </w:t>
+      </w:r>
+      <w:r>
+        <w:t>pri vkladaní duplicitných kľúčov sa našiel správny počet hodnôt, no pôvodné hodnoty boli prepísané duplicitami.</w:t>
       </w:r>
     </w:p>
     <w:p>
@@ -2431,14 +2176,9 @@
       <w:bookmarkStart w:id="4" w:name="_Toc243767154"/>
       <w:r>
         <w:lastRenderedPageBreak/>
-        <w:t xml:space="preserve">KD Strom z GitHub repozitára od používateľa </w:t>
-      </w:r>
-      <w:proofErr w:type="spellStart"/>
-      <w:r>
-        <w:t>Oschrenk</w:t>
+        <w:t>KD Strom z GitHub repozitára od používateľa Oschrenk</w:t>
       </w:r>
       <w:bookmarkEnd w:id="4"/>
-      <w:proofErr w:type="spellEnd"/>
     </w:p>
     <w:p>
       <w:pPr>
@@ -2474,30 +2214,8 @@
         <w:rPr>
           <w:u w:val="single"/>
         </w:rPr>
-        <w:t xml:space="preserve">Apache </w:t>
-      </w:r>
-      <w:proofErr w:type="spellStart"/>
-      <w:r>
-        <w:rPr>
-          <w:u w:val="single"/>
-        </w:rPr>
-        <w:t>NetBeans</w:t>
-      </w:r>
-      <w:proofErr w:type="spellEnd"/>
-      <w:r>
-        <w:rPr>
-          <w:u w:val="single"/>
-        </w:rPr>
-        <w:t xml:space="preserve"> </w:t>
-      </w:r>
-      <w:proofErr w:type="spellStart"/>
-      <w:r>
-        <w:rPr>
-          <w:u w:val="single"/>
-        </w:rPr>
-        <w:t>profilera</w:t>
-      </w:r>
-      <w:proofErr w:type="spellEnd"/>
+        <w:t>Apache NetBeans profilera</w:t>
+      </w:r>
     </w:p>
     <w:p>
       <w:pPr>
@@ -2525,30 +2243,8 @@
         <w:rPr>
           <w:u w:val="single"/>
         </w:rPr>
-        <w:t xml:space="preserve">Apache </w:t>
-      </w:r>
-      <w:proofErr w:type="spellStart"/>
-      <w:r>
-        <w:rPr>
-          <w:u w:val="single"/>
-        </w:rPr>
-        <w:t>NetBeans</w:t>
-      </w:r>
-      <w:proofErr w:type="spellEnd"/>
-      <w:r>
-        <w:rPr>
-          <w:u w:val="single"/>
-        </w:rPr>
-        <w:t xml:space="preserve"> </w:t>
-      </w:r>
-      <w:proofErr w:type="spellStart"/>
-      <w:r>
-        <w:rPr>
-          <w:u w:val="single"/>
-        </w:rPr>
-        <w:t>profilera</w:t>
-      </w:r>
-      <w:proofErr w:type="spellEnd"/>
+        <w:t>Apache NetBeans profilera</w:t>
+      </w:r>
     </w:p>
     <w:p>
       <w:pPr>
@@ -2660,6 +2356,7 @@
         <w:rPr>
           <w:b/>
           <w:bCs/>
+          <w:noProof/>
         </w:rPr>
         <w:drawing>
           <wp:anchor distT="0" distB="0" distL="114300" distR="114300" simplePos="0" relativeHeight="251660288" behindDoc="0" locked="0" layoutInCell="1" allowOverlap="1" wp14:anchorId="5BF41CCF" wp14:editId="45033047">
@@ -2837,35 +2534,17 @@
           <w:b/>
           <w:bCs/>
         </w:rPr>
-        <w:t xml:space="preserve">Implementácia od používateľa </w:t>
-      </w:r>
-      <w:proofErr w:type="spellStart"/>
-      <w:r>
-        <w:rPr>
-          <w:b/>
-          <w:bCs/>
-        </w:rPr>
-        <w:t>Oschrenk</w:t>
-      </w:r>
-      <w:proofErr w:type="spellEnd"/>
-      <w:r>
-        <w:rPr>
-          <w:b/>
-          <w:bCs/>
-        </w:rPr>
-        <w:t>:</w:t>
+        <w:t>Implementácia od používateľa Oschrenk:</w:t>
       </w:r>
       <w:r>
         <w:t xml:space="preserve"> umožňuje používať iba </w:t>
       </w:r>
-      <w:proofErr w:type="spellStart"/>
       <w:r>
         <w:rPr>
           <w:u w:val="single"/>
         </w:rPr>
         <w:t>double</w:t>
       </w:r>
-      <w:proofErr w:type="spellEnd"/>
       <w:r>
         <w:t xml:space="preserve"> súradnice. Nie je umožnená univerzálnosť kľúča</w:t>
       </w:r>
@@ -2886,35 +2565,17 @@
           <w:b/>
           <w:bCs/>
         </w:rPr>
-        <w:t xml:space="preserve">Implementácia od používateľa </w:t>
-      </w:r>
-      <w:proofErr w:type="spellStart"/>
-      <w:r>
-        <w:rPr>
-          <w:b/>
-          <w:bCs/>
-        </w:rPr>
-        <w:t>Varunpant</w:t>
-      </w:r>
-      <w:proofErr w:type="spellEnd"/>
-      <w:r>
-        <w:rPr>
-          <w:b/>
-          <w:bCs/>
-        </w:rPr>
-        <w:t>:</w:t>
+        <w:t>Implementácia od používateľa Varunpant:</w:t>
       </w:r>
       <w:r>
         <w:t xml:space="preserve"> umožňuje používať iba </w:t>
       </w:r>
-      <w:proofErr w:type="spellStart"/>
       <w:r>
         <w:rPr>
           <w:u w:val="single"/>
         </w:rPr>
         <w:t>double</w:t>
       </w:r>
-      <w:proofErr w:type="spellEnd"/>
       <w:r>
         <w:t xml:space="preserve"> súradnice. Nie je umožnená univerzálnosť kľúča.</w:t>
       </w:r>
@@ -2971,6 +2632,7 @@
         <w:rPr>
           <w:b/>
           <w:bCs/>
+          <w:noProof/>
         </w:rPr>
         <w:drawing>
           <wp:anchor distT="0" distB="0" distL="114300" distR="114300" simplePos="0" relativeHeight="251664384" behindDoc="0" locked="0" layoutInCell="1" allowOverlap="1" wp14:anchorId="187E7979" wp14:editId="75C99E81">
@@ -3032,6 +2694,7 @@
         <w:rPr>
           <w:b/>
           <w:bCs/>
+          <w:noProof/>
         </w:rPr>
         <w:drawing>
           <wp:anchor distT="0" distB="0" distL="114300" distR="114300" simplePos="0" relativeHeight="251665408" behindDoc="0" locked="0" layoutInCell="1" allowOverlap="1" wp14:anchorId="4BE805EE" wp14:editId="34CD853F">
@@ -3105,6 +2768,7 @@
         <w:rPr>
           <w:b/>
           <w:bCs/>
+          <w:noProof/>
         </w:rPr>
         <w:drawing>
           <wp:anchor distT="0" distB="0" distL="114300" distR="114300" simplePos="0" relativeHeight="251666432" behindDoc="0" locked="0" layoutInCell="1" allowOverlap="1" wp14:anchorId="45400FA3" wp14:editId="453FF86D">
@@ -3409,23 +3073,7 @@
           <w:b/>
           <w:bCs/>
         </w:rPr>
-        <w:t xml:space="preserve">Cyklus </w:t>
-      </w:r>
-      <w:proofErr w:type="spellStart"/>
-      <w:r>
-        <w:rPr>
-          <w:b/>
-          <w:bCs/>
-        </w:rPr>
-        <w:t>while</w:t>
-      </w:r>
-      <w:proofErr w:type="spellEnd"/>
-      <w:r>
-        <w:rPr>
-          <w:b/>
-          <w:bCs/>
-        </w:rPr>
-        <w:t>:</w:t>
+        <w:t>Cyklus while:</w:t>
       </w:r>
     </w:p>
     <w:p>
@@ -3477,23 +3125,7 @@
           <w:b/>
           <w:bCs/>
         </w:rPr>
-        <w:t xml:space="preserve">Prehliadka aktuálneho uzla v cykle </w:t>
-      </w:r>
-      <w:proofErr w:type="spellStart"/>
-      <w:r>
-        <w:rPr>
-          <w:b/>
-          <w:bCs/>
-        </w:rPr>
-        <w:t>while</w:t>
-      </w:r>
-      <w:proofErr w:type="spellEnd"/>
-      <w:r>
-        <w:rPr>
-          <w:b/>
-          <w:bCs/>
-        </w:rPr>
-        <w:t>:</w:t>
+        <w:t>Prehliadka aktuálneho uzla v cykle while:</w:t>
       </w:r>
     </w:p>
     <w:p>
@@ -3757,23 +3389,7 @@
         <w:t>Pozn.:</w:t>
       </w:r>
       <w:r>
-        <w:t xml:space="preserve"> Algoritmus v momentálnej podobe pravdepodobne nefunguje efektívne. Zatiaľ som neprišiel na spôsob, ako tento algoritmus zastaviť skôr ako v listoch stromu. Algoritmus však nevyužíva </w:t>
-      </w:r>
-      <w:proofErr w:type="spellStart"/>
-      <w:r>
-        <w:t>rekurziu</w:t>
-      </w:r>
-      <w:proofErr w:type="spellEnd"/>
-      <w:r>
-        <w:t xml:space="preserve"> a neprehľadáva celý strom – pri vyhľadávaní sú niektoré </w:t>
-      </w:r>
-      <w:proofErr w:type="spellStart"/>
-      <w:r>
-        <w:t>podstromy</w:t>
-      </w:r>
-      <w:proofErr w:type="spellEnd"/>
-      <w:r>
-        <w:t xml:space="preserve"> vynechané.</w:t>
+        <w:t xml:space="preserve"> Algoritmus v momentálnej podobe pravdepodobne nefunguje efektívne. Zatiaľ som neprišiel na spôsob, ako tento algoritmus zastaviť skôr ako v listoch stromu. Algoritmus však nevyužíva rekurziu a neprehľadáva celý strom – pri vyhľadávaní sú niektoré podstromy vynechané.</w:t>
       </w:r>
     </w:p>
     <w:sectPr>
@@ -7593,6 +7209,7 @@
   <w:style w:type="character" w:default="1" w:styleId="DefaultParagraphFont">
     <w:name w:val="Default Paragraph Font"/>
     <w:uiPriority w:val="1"/>
+    <w:semiHidden/>
     <w:unhideWhenUsed/>
   </w:style>
   <w:style w:type="table" w:default="1" w:styleId="TableNormal">
@@ -8145,6 +7762,7 @@
     <w:rsid w:val="00491B40"/>
     <w:rsid w:val="00556739"/>
     <w:rsid w:val="00560924"/>
+    <w:rsid w:val="005F11D2"/>
     <w:rsid w:val="00687D0F"/>
     <w:rsid w:val="006C0D51"/>
     <w:rsid w:val="0079426B"/>
@@ -8163,6 +7781,7 @@
     <w:rsid w:val="00B77ABD"/>
     <w:rsid w:val="00C32059"/>
     <w:rsid w:val="00C957F0"/>
+    <w:rsid w:val="00C975DD"/>
     <w:rsid w:val="00D01EC0"/>
     <w:rsid w:val="00D77460"/>
     <w:rsid w:val="00DB0B32"/>
@@ -8940,16 +8559,25 @@
 </file>
 
 <file path=customXml/item1.xml><?xml version="1.0" encoding="utf-8"?>
-<b:Sources xmlns:b="http://schemas.openxmlformats.org/officeDocument/2006/bibliography" xmlns="http://schemas.openxmlformats.org/officeDocument/2006/bibliography" SelectedStyle="\APASixthEditionOfficeOnline.xsl" StyleName="APA" Version="6"/>
-</file>
-
-<file path=customXml/item2.xml><?xml version="1.0" encoding="utf-8"?>
 <p:properties xmlns:p="http://schemas.microsoft.com/office/2006/metadata/properties" xmlns:xsi="http://www.w3.org/2001/XMLSchema-instance" xmlns:pc="http://schemas.microsoft.com/office/infopath/2007/PartnerControls">
   <documentManagement/>
 </p:properties>
 </file>
 
+<file path=customXml/item2.xml><?xml version="1.0" encoding="utf-8"?>
+<b:Sources xmlns:b="http://schemas.openxmlformats.org/officeDocument/2006/bibliography" xmlns="http://schemas.openxmlformats.org/officeDocument/2006/bibliography" SelectedStyle="\APASixthEditionOfficeOnline.xsl" StyleName="APA" Version="6"/>
+</file>
+
 <file path=customXml/item3.xml><?xml version="1.0" encoding="utf-8"?>
+<?mso-contentType ?>
+<FormTemplates xmlns="http://schemas.microsoft.com/sharepoint/v3/contenttype/forms">
+  <Display>DocumentLibraryForm</Display>
+  <Edit>DocumentLibraryForm</Edit>
+  <New>DocumentLibraryForm</New>
+</FormTemplates>
+</file>
+
+<file path=customXml/item4.xml><?xml version="1.0" encoding="utf-8"?>
 <ct:contentTypeSchema xmlns:ct="http://schemas.microsoft.com/office/2006/metadata/contentType" xmlns:ma="http://schemas.microsoft.com/office/2006/metadata/properties/metaAttributes" ct:_="" ma:_="" ma:contentTypeName="Dokument" ma:contentTypeID="0x0101003AB2D83F1BFE774693A9D47ED296DF0D" ma:contentTypeVersion="9" ma:contentTypeDescription="Umožňuje vytvoriť nový dokument." ma:contentTypeScope="" ma:versionID="60122e2a515457b5823611993d906c8b">
   <xsd:schema xmlns:xsd="http://www.w3.org/2001/XMLSchema" xmlns:xs="http://www.w3.org/2001/XMLSchema" xmlns:p="http://schemas.microsoft.com/office/2006/metadata/properties" xmlns:ns2="7d1569f7-a9ba-4934-9f41-02a47fb0fb0d" targetNamespace="http://schemas.microsoft.com/office/2006/metadata/properties" ma:root="true" ma:fieldsID="d3efe9633a98463fed113fc2a31a3b47" ns2:_="">
     <xsd:import namespace="7d1569f7-a9ba-4934-9f41-02a47fb0fb0d"/>
@@ -9123,24 +8751,7 @@
 </ct:contentTypeSchema>
 </file>
 
-<file path=customXml/item4.xml><?xml version="1.0" encoding="utf-8"?>
-<?mso-contentType ?>
-<FormTemplates xmlns="http://schemas.microsoft.com/sharepoint/v3/contenttype/forms">
-  <Display>DocumentLibraryForm</Display>
-  <Edit>DocumentLibraryForm</Edit>
-  <New>DocumentLibraryForm</New>
-</FormTemplates>
-</file>
-
 <file path=customXml/itemProps1.xml><?xml version="1.0" encoding="utf-8"?>
-<ds:datastoreItem xmlns:ds="http://schemas.openxmlformats.org/officeDocument/2006/customXml" ds:itemID="{DC141BBF-D250-46B3-8BB9-3FC834D9A0D1}">
-  <ds:schemaRefs>
-    <ds:schemaRef ds:uri="http://schemas.openxmlformats.org/officeDocument/2006/bibliography"/>
-  </ds:schemaRefs>
-</ds:datastoreItem>
-</file>
-
-<file path=customXml/itemProps2.xml><?xml version="1.0" encoding="utf-8"?>
 <ds:datastoreItem xmlns:ds="http://schemas.openxmlformats.org/officeDocument/2006/customXml" ds:itemID="{FE7A2F48-B42E-4D81-8042-A4FF78073969}">
   <ds:schemaRefs>
     <ds:schemaRef ds:uri="http://schemas.microsoft.com/office/2006/metadata/properties"/>
@@ -9149,7 +8760,23 @@
 </ds:datastoreItem>
 </file>
 
+<file path=customXml/itemProps2.xml><?xml version="1.0" encoding="utf-8"?>
+<ds:datastoreItem xmlns:ds="http://schemas.openxmlformats.org/officeDocument/2006/customXml" ds:itemID="{DC141BBF-D250-46B3-8BB9-3FC834D9A0D1}">
+  <ds:schemaRefs>
+    <ds:schemaRef ds:uri="http://schemas.openxmlformats.org/officeDocument/2006/bibliography"/>
+  </ds:schemaRefs>
+</ds:datastoreItem>
+</file>
+
 <file path=customXml/itemProps3.xml><?xml version="1.0" encoding="utf-8"?>
+<ds:datastoreItem xmlns:ds="http://schemas.openxmlformats.org/officeDocument/2006/customXml" ds:itemID="{82CF81AA-32B6-4712-911A-7ADBBAC06A62}">
+  <ds:schemaRefs>
+    <ds:schemaRef ds:uri="http://schemas.microsoft.com/sharepoint/v3/contenttype/forms"/>
+  </ds:schemaRefs>
+</ds:datastoreItem>
+</file>
+
+<file path=customXml/itemProps4.xml><?xml version="1.0" encoding="utf-8"?>
 <ds:datastoreItem xmlns:ds="http://schemas.openxmlformats.org/officeDocument/2006/customXml" ds:itemID="{7B2C86A9-DC76-405D-BE13-BFDC736CF9BD}">
   <ds:schemaRefs>
     <ds:schemaRef ds:uri="http://schemas.microsoft.com/office/2006/metadata/contentType"/>
@@ -9165,12 +8792,4 @@
     <ds:schemaRef ds:uri="http://schemas.microsoft.com/internal/obd"/>
   </ds:schemaRefs>
 </ds:datastoreItem>
-</file>
-
-<file path=customXml/itemProps4.xml><?xml version="1.0" encoding="utf-8"?>
-<ds:datastoreItem xmlns:ds="http://schemas.openxmlformats.org/officeDocument/2006/customXml" ds:itemID="{82CF81AA-32B6-4712-911A-7ADBBAC06A62}">
-  <ds:schemaRefs>
-    <ds:schemaRef ds:uri="http://schemas.microsoft.com/sharepoint/v3/contenttype/forms"/>
-  </ds:schemaRefs>
-</ds:datastoreItem>
 </file>
</xml_diff>